<commit_message>
Remove references to the known issues taken out of document 04.
Co-authored-by: Cursor <cursoragent@cursor.com>
</commit_message>
<xml_diff>
--- a/docs/handover/word/07 - API Reference.docx
+++ b/docs/handover/word/07 - API Reference.docx
@@ -321,7 +321,7 @@
         <w:pStyle w:val="ListBullet"/>
       </w:pPr>
       <w:r>
-        <w:t>There is NO auth token check. The frontend sends 'Authorization: Bearer &lt;token&gt;' but neither backend validates it. The API trusts whatever logged_in_user_id the caller sends, and role checks are made from that id. Several role checks run only when logged_in_user_id is present. See 04 Known issues.</w:t>
+        <w:t>There is NO auth token check. The frontend sends 'Authorization: Bearer &lt;token&gt;' but neither backend validates it. The API trusts whatever logged_in_user_id the caller sends, and role checks are made from that id. Several role checks run only when logged_in_user_id is present.</w:t>
       </w:r>
     </w:p>
     <w:p>
@@ -13684,14 +13684,6 @@
       </w:pPr>
       <w:r>
         <w:t>Flask POST /api_log_list/logs, /task/add, /task/update, /task/delete and /user_monthly_tracker/delete have no role check at all.</w:t>
-      </w:r>
-    </w:p>
-    <w:p>
-      <w:pPr>
-        <w:pStyle w:val="ListBullet"/>
-      </w:pPr>
-      <w:r>
-        <w:t>See 04 Known issues for the wider problem: no token validation, trust in logged_in_user_id.</w:t>
       </w:r>
     </w:p>
     <w:sectPr>

</xml_diff>

<commit_message>
QC audit report: QA and Assistant Team Leader see only audits on their own QC
Co-authored-by: Cursor <cursoragent@cursor.com>
</commit_message>
<xml_diff>
--- a/docs/handover/word/07 - API Reference.docx
+++ b/docs/handover/word/07 - API Reference.docx
@@ -5901,17 +5901,17 @@
           </w:tcPr>
           <w:p>
             <w:r>
-              <w:t>start_date, end_date, qc_start_date, qc_end_date (default: current month)</w:t>
-            </w:r>
-          </w:p>
-        </w:tc>
-        <w:tc>
-          <w:tcPr>
-            <w:tcW w:type="dxa" w:w="2256"/>
-          </w:tcPr>
-          <w:p>
-            <w:r>
-              <w:t>None - no check</w:t>
+              <w:t>logged_in_user_id, start_date, end_date, qc_start_date, qc_end_date (default: current month)</w:t>
+            </w:r>
+          </w:p>
+        </w:tc>
+        <w:tc>
+          <w:tcPr>
+            <w:tcW w:type="dxa" w:w="2256"/>
+          </w:tcPr>
+          <w:p>
+            <w:r>
+              <w:t>Any caller; QA and Asst Team Leader get only audits on their own QC (qr.qa_user_id)</w:t>
             </w:r>
           </w:p>
         </w:tc>

</xml_diff>